<commit_message>
Update more specs and testcase database
</commit_message>
<xml_diff>
--- a/docs/32102-i00.docx
+++ b/docs/32102-i00.docx
@@ -491,7 +491,7 @@
                                 <v:shape id="ole_rId2" type="_x0000_tole_rId2" style="width:101.3pt;height:62.55pt" filled="f" o:ole="">
                                   <v:imagedata r:id="rId3" o:title=""/>
                                 </v:shape>
-                                <o:OLEObject Type="Embed" ProgID="" ShapeID="ole_rId2" DrawAspect="Content" ObjectID="_774057470" r:id="rId2"/>
+                                <o:OLEObject Type="Embed" ProgID="" ShapeID="ole_rId2" DrawAspect="Content" ObjectID="_1419013939" r:id="rId2"/>
                               </w:object>
                             </w:r>
                             <w:r>
@@ -624,7 +624,7 @@
                           <v:shape id="ole_rId5" type="_x0000_tole_rId5" style="width:101.3pt;height:62.55pt" filled="f" o:ole="">
                             <v:imagedata r:id="rId6" o:title=""/>
                           </v:shape>
-                          <o:OLEObject Type="Embed" ProgID="" ShapeID="ole_rId5" DrawAspect="Content" ObjectID="_1993275295" r:id="rId5"/>
+                          <o:OLEObject Type="Embed" ProgID="" ShapeID="ole_rId5" DrawAspect="Content" ObjectID="_372962777" r:id="rId5"/>
                         </w:object>
                       </w:r>
                       <w:r>
@@ -8377,7 +8377,7 @@
           <v:shape id="ole_rId11" type="_x0000_tole_rId11" style="width:411.1pt;height:154.45pt" filled="f" o:ole="">
             <v:imagedata r:id="rId12" o:title=""/>
           </v:shape>
-          <o:OLEObject Type="Embed" ProgID="" ShapeID="ole_rId11" DrawAspect="Content" ObjectID="_996814249" r:id="rId11"/>
+          <o:OLEObject Type="Embed" ProgID="" ShapeID="ole_rId11" DrawAspect="Content" ObjectID="_919920916" r:id="rId11"/>
         </w:object>
       </w:r>
     </w:p>
@@ -8596,7 +8596,7 @@
           <v:shape id="ole_rId13" type="_x0000_tole_rId13" style="width:481.65pt;height:126.65pt" filled="f" o:ole="">
             <v:imagedata r:id="rId14" o:title=""/>
           </v:shape>
-          <o:OLEObject Type="Embed" ProgID="" ShapeID="ole_rId13" DrawAspect="Content" ObjectID="_1058821275" r:id="rId13"/>
+          <o:OLEObject Type="Embed" ProgID="" ShapeID="ole_rId13" DrawAspect="Content" ObjectID="_1309112118" r:id="rId13"/>
         </w:object>
       </w:r>
     </w:p>
@@ -8810,7 +8810,7 @@
           <v:shape id="ole_rId15" type="_x0000_tole_rId15" style="width:481.6pt;height:146.45pt" filled="f" o:ole="">
             <v:imagedata r:id="rId16" o:title=""/>
           </v:shape>
-          <o:OLEObject Type="Embed" ProgID="" ShapeID="ole_rId15" DrawAspect="Content" ObjectID="_1126642439" r:id="rId15"/>
+          <o:OLEObject Type="Embed" ProgID="" ShapeID="ole_rId15" DrawAspect="Content" ObjectID="_434194926" r:id="rId15"/>
         </w:object>
       </w:r>
     </w:p>
@@ -8911,7 +8911,7 @@
           <v:shape id="ole_rId17" type="_x0000_tole_rId17" style="width:481.45pt;height:428.45pt" filled="f" o:ole="">
             <v:imagedata r:id="rId18" o:title=""/>
           </v:shape>
-          <o:OLEObject Type="Embed" ProgID="" ShapeID="ole_rId17" DrawAspect="Content" ObjectID="_577160448" r:id="rId17"/>
+          <o:OLEObject Type="Embed" ProgID="" ShapeID="ole_rId17" DrawAspect="Content" ObjectID="_70290963" r:id="rId17"/>
         </w:object>
       </w:r>
     </w:p>
@@ -8968,7 +8968,7 @@
           <v:shape id="ole_rId19" type="_x0000_tole_rId19" style="width:382.6pt;height:364.55pt" filled="f" o:ole="">
             <v:imagedata r:id="rId20" o:title=""/>
           </v:shape>
-          <o:OLEObject Type="Embed" ProgID="" ShapeID="ole_rId19" DrawAspect="Content" ObjectID="_429183830" r:id="rId19"/>
+          <o:OLEObject Type="Embed" ProgID="" ShapeID="ole_rId19" DrawAspect="Content" ObjectID="_1957983009" r:id="rId19"/>
         </w:object>
       </w:r>
     </w:p>
@@ -9683,7 +9683,7 @@
           <v:shape id="ole_rId21" type="_x0000_tole_rId21" style="width:425.25pt;height:497.6pt" filled="f" o:ole="">
             <v:imagedata r:id="rId22" o:title=""/>
           </v:shape>
-          <o:OLEObject Type="Embed" ProgID="" ShapeID="ole_rId21" DrawAspect="Content" ObjectID="_1439908137" r:id="rId21"/>
+          <o:OLEObject Type="Embed" ProgID="" ShapeID="ole_rId21" DrawAspect="Content" ObjectID="_748777946" r:id="rId21"/>
         </w:object>
       </w:r>
     </w:p>
@@ -10075,7 +10075,7 @@
           <v:shape id="ole_rId23" type="_x0000_tole_rId23" style="width:460.7pt;height:391.35pt" filled="f" o:ole="">
             <v:imagedata r:id="rId24" o:title=""/>
           </v:shape>
-          <o:OLEObject Type="Embed" ProgID="" ShapeID="ole_rId23" DrawAspect="Content" ObjectID="_1629163595" r:id="rId23"/>
+          <o:OLEObject Type="Embed" ProgID="" ShapeID="ole_rId23" DrawAspect="Content" ObjectID="_327453036" r:id="rId23"/>
         </w:object>
       </w:r>
     </w:p>
@@ -10165,7 +10165,7 @@
           <v:shape id="ole_rId25" type="_x0000_tole_rId25" style="width:432.35pt;height:143.65pt" filled="f" o:ole="">
             <v:imagedata r:id="rId26" o:title=""/>
           </v:shape>
-          <o:OLEObject Type="Embed" ProgID="" ShapeID="ole_rId25" DrawAspect="Content" ObjectID="_354003036" r:id="rId25"/>
+          <o:OLEObject Type="Embed" ProgID="" ShapeID="ole_rId25" DrawAspect="Content" ObjectID="_848476566" r:id="rId25"/>
         </w:object>
       </w:r>
     </w:p>
@@ -10508,7 +10508,7 @@
           <v:shape id="ole_rId27" type="_x0000_tole_rId27" style="width:411.1pt;height:179.05pt" filled="f" o:ole="">
             <v:imagedata r:id="rId28" o:title=""/>
           </v:shape>
-          <o:OLEObject Type="Embed" ProgID="" ShapeID="ole_rId27" DrawAspect="Content" ObjectID="_79149473" r:id="rId27"/>
+          <o:OLEObject Type="Embed" ProgID="" ShapeID="ole_rId27" DrawAspect="Content" ObjectID="_1396106926" r:id="rId27"/>
         </w:object>
       </w:r>
     </w:p>
@@ -10898,7 +10898,7 @@
           <v:shape id="ole_rId29" type="_x0000_tole_rId29" style="width:311.85pt;height:228.9pt" filled="f" o:ole="">
             <v:imagedata r:id="rId30" o:title=""/>
           </v:shape>
-          <o:OLEObject Type="Embed" ProgID="" ShapeID="ole_rId29" DrawAspect="Content" ObjectID="_163475601" r:id="rId29"/>
+          <o:OLEObject Type="Embed" ProgID="" ShapeID="ole_rId29" DrawAspect="Content" ObjectID="_1541242063" r:id="rId29"/>
         </w:object>
       </w:r>
     </w:p>
@@ -11813,7 +11813,7 @@
           <v:shape id="ole_rId34" type="_x0000_tole_rId34" style="width:342.8pt;height:42.25pt" filled="f" o:ole="">
             <v:imagedata r:id="rId35" o:title=""/>
           </v:shape>
-          <o:OLEObject Type="Embed" ProgID="" ShapeID="ole_rId34" DrawAspect="Content" ObjectID="_1123498471" r:id="rId34"/>
+          <o:OLEObject Type="Embed" ProgID="" ShapeID="ole_rId34" DrawAspect="Content" ObjectID="_1745204165" r:id="rId34"/>
         </w:object>
       </w:r>
     </w:p>
@@ -13400,7 +13400,7 @@
           <v:shape id="ole_rId36" type="_x0000_tole_rId36" style="width:408.75pt;height:224.25pt" filled="f" o:ole="">
             <v:imagedata r:id="rId37" o:title=""/>
           </v:shape>
-          <o:OLEObject Type="Embed" ProgID="" ShapeID="ole_rId36" DrawAspect="Content" ObjectID="_529958956" r:id="rId36"/>
+          <o:OLEObject Type="Embed" ProgID="" ShapeID="ole_rId36" DrawAspect="Content" ObjectID="_182868891" r:id="rId36"/>
         </w:object>
       </w:r>
     </w:p>
@@ -15237,7 +15237,7 @@
           <v:shape id="ole_rId39" type="_x0000_tole_rId39" style="width:453.15pt;height:355.25pt" filled="f" o:ole="">
             <v:imagedata r:id="rId40" o:title=""/>
           </v:shape>
-          <o:OLEObject Type="Embed" ProgID="" ShapeID="ole_rId39" DrawAspect="Content" ObjectID="_87678508" r:id="rId39"/>
+          <o:OLEObject Type="Embed" ProgID="" ShapeID="ole_rId39" DrawAspect="Content" ObjectID="_1116906730" r:id="rId39"/>
         </w:object>
       </w:r>
     </w:p>

</xml_diff>